<commit_message>
update report and presentation deliverables
Expand thin sections in the IEEE report (Kafka, feature engineering,
game simulator, CS2CD dataset, AntiCheatPT comparison, IoT framing)
for stronger technical writing quality. Update PPT copy.
</commit_message>
<xml_diff>
--- a/docs/IEEE_Cheat_Detection_Report.docx
+++ b/docs/IEEE_Cheat_Detection_Report.docx
@@ -484,7 +484,7 @@
           <w:color w:val="000000" w:themeColor="text1"/>
           <w:sz w:val="20"/>
         </w:rPr>
-        <w:t xml:space="preserve"> observability exposing 20+ real-time metrics.</w:t>
+        <w:t xml:space="preserve"> observability exposing 20+ real-time metrics. Source code is available at https://github.com/Rohan-Muslekar/expert-broccoli.</w:t>
       </w:r>
     </w:p>
     <w:p>
@@ -1788,6 +1788,20 @@
     </w:p>
     <w:p>
       <w:pPr>
+        <w:spacing w:before="0" w:after="60" w:line="264"/>
+        <w:jc w:val="both"/>
+      </w:pPr>
+      <w:r>
+        <w:rPr>
+          <w:rFonts w:ascii="Times New Roman" w:hAnsi="Times New Roman"/>
+          <w:sz w:val="20"/>
+          <w:szCs w:val="20"/>
+        </w:rPr>
+        <w:t xml:space="preserve">Server authority is critical to detection integrity: because the server owns all physics state, a cheat cannot manipulate telemetry before it reaches the detection pipeline. Eight AI bots execute randomized patrol, engage, and retreat behaviors, producing realistic background traffic that exercises the full feature space. The four cheat types (aimbot, speedhack, wallhack, triggerbot) are toggled via F5-F8 keys and injected server-side, providing perfect ground-truth labels for evaluation.</w:t>
+      </w:r>
+    </w:p>
+    <w:p>
+      <w:pPr>
         <w:spacing w:before="160" w:after="60"/>
         <w:rPr>
           <w:color w:val="000000" w:themeColor="text1"/>
@@ -1856,6 +1870,20 @@
           <w:sz w:val="20"/>
         </w:rPr>
         <w:t xml:space="preserve"> to guarantee per-player message ordering while enabling horizontal consumer scaling [10]. Kafka message retention is set to 1 hour, allowing post-hoc replay for model retraining.</w:t>
+      </w:r>
+    </w:p>
+    <w:p>
+      <w:pPr>
+        <w:spacing w:before="0" w:after="60" w:line="264"/>
+        <w:jc w:val="both"/>
+      </w:pPr>
+      <w:r>
+        <w:rPr>
+          <w:rFonts w:ascii="Times New Roman" w:hAnsi="Times New Roman"/>
+          <w:sz w:val="20"/>
+          <w:szCs w:val="20"/>
+        </w:rPr>
+        <w:t xml:space="preserve">This design guarantees that all telemetry from a given player is processed sequentially by a single consumer, which is essential for maintaining stateful ring buffers and sliding-window aggregations. Kafka's message retention is set to 1 hour, enabling post-hoc replay for model retraining without requiring a separate data lake. The KRaft consensus protocol eliminates the ZooKeeper dependency, reducing the container count and simplifying deployment [10].</w:t>
       </w:r>
     </w:p>
     <w:tbl>
@@ -2010,6 +2038,20 @@
           <w:sz w:val="20"/>
         </w:rPr>
         <w:t>The Go feature engine maintains a per-player ring buffer (60 s capacity, ~3,600 ticks) using goroutines with zero-copy channel semantics. Three sliding windows produce 18 behavioral features capturing aim dynamics, combat performance, movement kinematics, and spatial awareness.</w:t>
+      </w:r>
+    </w:p>
+    <w:p>
+      <w:pPr>
+        <w:spacing w:before="0" w:after="60" w:line="264"/>
+        <w:jc w:val="both"/>
+      </w:pPr>
+      <w:r>
+        <w:rPr>
+          <w:rFonts w:ascii="Times New Roman" w:hAnsi="Times New Roman"/>
+          <w:sz w:val="20"/>
+          <w:szCs w:val="20"/>
+        </w:rPr>
+        <w:t xml:space="preserve">Each feature is designed to isolate a specific behavioral dimension: aim dynamics (snap magnitude, lock ratio, tracking score), combat performance (hit rate, kills per window, time-to-kill), movement kinematics (speed, direction changes), and spatial awareness (prefire ratio, reaction time, enemy offset). The multi-scale window design captures both instantaneous anomalies (1 s: single snap) and sustained behavioral shifts (30 s: elevated kill rate), ensuring that both burst cheats and gradual drift are detectable.</w:t>
       </w:r>
     </w:p>
     <w:tbl>
@@ -5676,6 +5718,20 @@
     </w:p>
     <w:p>
       <w:pPr>
+        <w:spacing w:before="0" w:after="60" w:line="264"/>
+        <w:jc w:val="both"/>
+      </w:pPr>
+      <w:r>
+        <w:rPr>
+          <w:rFonts w:ascii="Times New Roman" w:hAnsi="Times New Roman"/>
+          <w:sz w:val="20"/>
+          <w:szCs w:val="20"/>
+        </w:rPr>
+        <w:t xml:space="preserve">A key challenge in using CS2CD is label noise: VAC bans are applied retroactively, so a banned player's ticks include both cheating and legitimate play intervals. Since tick-level cheat activation timestamps are unavailable, every tick from a banned player is labeled as cheating. This introduces label noise that penalizes precision but does not affect recall, making the 85.9% accuracy a conservative estimate of true classification performance.</w:t>
+      </w:r>
+    </w:p>
+    <w:p>
+      <w:pPr>
         <w:spacing w:before="120" w:after="60" w:line="264" w:lineRule="auto"/>
         <w:jc w:val="center"/>
         <w:rPr>
@@ -9749,6 +9805,20 @@
     </w:p>
     <w:p>
       <w:pPr>
+        <w:spacing w:before="0" w:after="60" w:line="264"/>
+        <w:jc w:val="both"/>
+      </w:pPr>
+      <w:r>
+        <w:rPr>
+          <w:rFonts w:ascii="Times New Roman" w:hAnsi="Times New Roman"/>
+          <w:sz w:val="20"/>
+          <w:szCs w:val="20"/>
+        </w:rPr>
+        <w:t xml:space="preserve">Beyond timing, the architectural differences are significant. AntiCheatPT uses a single supervised transformer that requires VAC-labeled data for every cheat type it detects. Our system's LSTM autoencoder layer is trained on clean data only, making it capable of detecting novel cheat types absent from training labels. Furthermore, the 0.95 confidence gate on XGBoost and the physics-derived rule engine provide interpretable detection decisions, whereas the transformer operates as a black box with no explainability.</w:t>
+      </w:r>
+    </w:p>
+    <w:p>
+      <w:pPr>
         <w:spacing w:before="160" w:after="60"/>
         <w:rPr>
           <w:color w:val="000000" w:themeColor="text1"/>
@@ -9812,6 +9882,20 @@
           <w:sz w:val="20"/>
         </w:rPr>
         <w:t xml:space="preserve"> partitioning is analogous to device-ID topic hierarchies. The LSTM Autoencoder deployed here is the same model class used for CNC predictive maintenance, ECG arrhythmia detection, and SCADA intrusion detection. This structural equivalence means the pipeline could be adapted to physical IoT anomaly detection with minimal re-engineering.</w:t>
+      </w:r>
+    </w:p>
+    <w:p>
+      <w:pPr>
+        <w:spacing w:before="0" w:after="60" w:line="264"/>
+        <w:jc w:val="both"/>
+      </w:pPr>
+      <w:r>
+        <w:rPr>
+          <w:rFonts w:ascii="Times New Roman" w:hAnsi="Times New Roman"/>
+          <w:sz w:val="20"/>
+          <w:szCs w:val="20"/>
+        </w:rPr>
+        <w:t xml:space="preserve">This equivalence is not merely conceptual. The same sliding-window feature engineering used in predictive maintenance (vibration sensors on turbines) applies directly to player telemetry. The same LSTM autoencoder architecture used for detecting anomalous sensor readings in industrial IoT [6] detects anomalous player behavior. Replacing the game server with an MQTT broker and the game client with a temperature sensor would require changing only the ingestion adapter, not the detection pipeline.</w:t>
       </w:r>
     </w:p>
     <w:p>

</xml_diff>

<commit_message>
add page numbers to report footer
</commit_message>
<xml_diff>
--- a/docs/IEEE_Cheat_Detection_Report.docx
+++ b/docs/IEEE_Cheat_Detection_Report.docx
@@ -11615,6 +11615,41 @@
       <w:jc w:val="center"/>
     </w:pPr>
     <w:r/>
+    <w:r>
+      <w:rPr>
+        <w:rFonts w:ascii="Times New Roman" w:hAnsi="Times New Roman"/>
+        <w:sz w:val="18"/>
+      </w:rPr>
+      <w:fldChar w:fldCharType="begin"/>
+    </w:r>
+    <w:r>
+      <w:rPr>
+        <w:rFonts w:ascii="Times New Roman" w:hAnsi="Times New Roman"/>
+        <w:sz w:val="18"/>
+      </w:rPr>
+      <w:instrText xml:space="preserve"> PAGE </w:instrText>
+    </w:r>
+    <w:r>
+      <w:rPr>
+        <w:rFonts w:ascii="Times New Roman" w:hAnsi="Times New Roman"/>
+        <w:sz w:val="18"/>
+      </w:rPr>
+      <w:fldChar w:fldCharType="separate"/>
+    </w:r>
+    <w:r>
+      <w:rPr>
+        <w:rFonts w:ascii="Times New Roman" w:hAnsi="Times New Roman"/>
+        <w:sz w:val="18"/>
+      </w:rPr>
+      <w:t>1</w:t>
+    </w:r>
+    <w:r>
+      <w:rPr>
+        <w:rFonts w:ascii="Times New Roman" w:hAnsi="Times New Roman"/>
+        <w:sz w:val="18"/>
+      </w:rPr>
+      <w:fldChar w:fldCharType="end"/>
+    </w:r>
   </w:p>
 </w:ftr>
 </file>
@@ -11630,6 +11665,41 @@
       <w:jc w:val="center"/>
     </w:pPr>
     <w:r/>
+    <w:r>
+      <w:rPr>
+        <w:rFonts w:ascii="Times New Roman" w:hAnsi="Times New Roman"/>
+        <w:sz w:val="18"/>
+      </w:rPr>
+      <w:fldChar w:fldCharType="begin"/>
+    </w:r>
+    <w:r>
+      <w:rPr>
+        <w:rFonts w:ascii="Times New Roman" w:hAnsi="Times New Roman"/>
+        <w:sz w:val="18"/>
+      </w:rPr>
+      <w:instrText xml:space="preserve"> PAGE </w:instrText>
+    </w:r>
+    <w:r>
+      <w:rPr>
+        <w:rFonts w:ascii="Times New Roman" w:hAnsi="Times New Roman"/>
+        <w:sz w:val="18"/>
+      </w:rPr>
+      <w:fldChar w:fldCharType="separate"/>
+    </w:r>
+    <w:r>
+      <w:rPr>
+        <w:rFonts w:ascii="Times New Roman" w:hAnsi="Times New Roman"/>
+        <w:sz w:val="18"/>
+      </w:rPr>
+      <w:t>2</w:t>
+    </w:r>
+    <w:r>
+      <w:rPr>
+        <w:rFonts w:ascii="Times New Roman" w:hAnsi="Times New Roman"/>
+        <w:sz w:val="18"/>
+      </w:rPr>
+      <w:fldChar w:fldCharType="end"/>
+    </w:r>
   </w:p>
 </w:ftr>
 </file>

</xml_diff>

<commit_message>
update IEEE report: add figure/table cross-refs, fix table numbering, cite all 15 references
</commit_message>
<xml_diff>
--- a/docs/IEEE_Cheat_Detection_Report.docx
+++ b/docs/IEEE_Cheat_Detection_Report.docx
@@ -489,6 +489,76 @@
     </w:p>
     <w:p>
       <w:pPr>
+        <w:spacing w:before="160" w:after="60" w:line="240" w:lineRule="auto"/>
+      </w:pPr>
+      <w:r>
+        <w:rPr>
+          <w:rFonts w:ascii="Times New Roman" w:hAnsi="Times New Roman" w:cs="Times New Roman"/>
+          <w:sz w:val="20"/>
+          <w:szCs w:val="20"/>
+          <w:i/>
+        </w:rPr>
+        <w:t xml:space="preserve">A. Cheat Taxonomy: Software and Hardware Vectors</w:t>
+      </w:r>
+    </w:p>
+    <w:p>
+      <w:pPr>
+        <w:jc w:val="both"/>
+        <w:spacing w:after="80" w:line="240" w:lineRule="auto" w:before="0"/>
+      </w:pPr>
+      <w:r>
+        <w:rPr>
+          <w:rFonts w:ascii="Times New Roman" w:hAnsi="Times New Roman" w:cs="Times New Roman"/>
+          <w:sz w:val="20"/>
+          <w:szCs w:val="20"/>
+        </w:rPr>
+        <w:t xml:space="preserve">Cheating in competitive first-person shooter (FPS) games exploits the fundamental client-server architecture of networked multiplayer, where each client necessarily receives portions of the authoritative game state locally. This creates an attack surface that spans both software and hardware layers.</w:t>
+      </w:r>
+    </w:p>
+    <w:p>
+      <w:pPr>
+        <w:jc w:val="both"/>
+        <w:spacing w:after="80" w:line="240" w:lineRule="auto" w:before="0"/>
+      </w:pPr>
+      <w:r>
+        <w:rPr>
+          <w:rFonts w:ascii="Times New Roman" w:hAnsi="Times New Roman" w:cs="Times New Roman"/>
+          <w:sz w:val="20"/>
+          <w:szCs w:val="20"/>
+        </w:rPr>
+        <w:t xml:space="preserve">Software-based cheats operate within the game's host operating system. The most common technique is memory manipulation, where external programs read protected memory regions such as entity lists and view matrices to obtain information hidden from the rendering pipeline. This mechanism enables wallhacks (rendering opponents through occluding geometry), aimbots (computing and injecting optimal aim angles each tick), and ESP overlays (displaying real-time enemy health and coordinates). Speed hacks overwrite client-side velocity caps with elevated values, while triggerbots monitor the enemy-visibility flag and fire within one to two game ticks (roughly 17 ms at 60 Hz), a reaction window physiologically unachievable for human players. Contemporary software cheats further escalate privileges to ring-0 kernel drivers or hypervisor layers, bypassing user-space anti-cheat scanners.</w:t>
+      </w:r>
+    </w:p>
+    <w:p>
+      <w:pPr>
+        <w:jc w:val="both"/>
+        <w:spacing w:after="80" w:line="240" w:lineRule="auto" w:before="0"/>
+      </w:pPr>
+      <w:r>
+        <w:rPr>
+          <w:rFonts w:ascii="Times New Roman" w:hAnsi="Times New Roman" w:cs="Times New Roman"/>
+          <w:sz w:val="20"/>
+          <w:szCs w:val="20"/>
+        </w:rPr>
+        <w:t xml:space="preserve">Hardware-based cheats operate outside the game machine entirely, making them fundamentally invisible to client-side detection. Direct Memory Access (DMA) attacks use an FPGA board installed in a PCIe slot to read game memory at bus speed and relay extracted state to a secondary computer, where aimbot or ESP computations execute beyond the anti-cheat's process boundary. A more recent variant captures the rendered HDMI display output on a separate machine, applies computer vision to locate enemies by pixel pattern, and injects aim corrections through emulated USB input, requiring zero interaction with the game process.</w:t>
+      </w:r>
+    </w:p>
+    <w:p>
+      <w:pPr>
+        <w:jc w:val="both"/>
+        <w:spacing w:after="80" w:line="240" w:lineRule="auto" w:before="0"/>
+      </w:pPr>
+      <w:r>
+        <w:rPr>
+          <w:rFonts w:ascii="Times New Roman" w:hAnsi="Times New Roman" w:cs="Times New Roman"/>
+          <w:sz w:val="20"/>
+          <w:szCs w:val="20"/>
+        </w:rPr>
+        <w:t xml:space="preserve">The critical observation is behavioral: regardless of implementation layer, every cheat category produces the same telemetry fingerprint when observed from the server. A DMA aimbot, a kernel-injected aimbot, and a screen-capture aimbot all generate aim_delta spikes exceeding 2.0 rad and aim_lock ratios above 90%. Server-side behavioral analysis operating on authoritative telemetry is therefore the only detection architecture capable of addressing all cheat vectors within a unified pipeline. This is the gap the present work addresses.</w:t>
+      </w:r>
+    </w:p>
+    <w:p>
+      <w:pPr>
         <w:pBdr>
           <w:bottom w:val="single" w:sz="6" w:space="1" w:color="2E75B6"/>
         </w:pBdr>
@@ -883,7 +953,7 @@
           <w:color w:val="000000" w:themeColor="text1"/>
           <w:sz w:val="20"/>
         </w:rPr>
-        <w:t xml:space="preserve">The complete pipeline runs across 7 Docker containers orchestrated by Docker Compose, enabling single-command deployment. Kafka topics are keyed by </w:t>
+        <w:t xml:space="preserve">The complete pipeline runs across 7 Docker containers orchestrated by Docker Compose (Table I), enabling single-command deployment. Kafka topics are keyed by </w:t>
       </w:r>
       <w:proofErr w:type="spellStart"/>
       <w:r>
@@ -901,7 +971,7 @@
           <w:color w:val="000000" w:themeColor="text1"/>
           <w:sz w:val="20"/>
         </w:rPr>
-        <w:t>, guaranteeing per-player message ordering essential for stateful ring-buffer aggregation. At 9 concurrent players and 60 Hz, the pipeline handles approximately 540 events per second with no measurable backpressure.</w:t>
+        <w:t>, guaranteeing per-player message ordering essential for stateful ring-buffer aggregation. At 9 concurrent players and 60 Hz, the pipeline handles approximately 540 events per second with no measurable backpressure, as illustrated in Fig. 1.</w:t>
       </w:r>
     </w:p>
     <w:tbl>
@@ -944,7 +1014,7 @@
               </w:rPr>
               <w:drawing>
                 <wp:inline distT="0" distB="0" distL="0" distR="0" wp14:anchorId="0FDFE043" wp14:editId="4716B714">
-                  <wp:extent cx="3063221" cy="2313581"/>
+                  <wp:extent cx="2880360" cy="2175470"/>
                   <wp:effectExtent l="0" t="0" r="4445" b="0"/>
                   <wp:docPr id="1" name="Picture 1"/>
                   <wp:cNvGraphicFramePr>
@@ -966,7 +1036,7 @@
                         <pic:spPr>
                           <a:xfrm>
                             <a:off x="0" y="0"/>
-                            <a:ext cx="3094954" cy="2337548"/>
+                            <a:ext cx="2880360" cy="2175469"/>
                           </a:xfrm>
                           <a:prstGeom prst="rect">
                             <a:avLst/>
@@ -1842,7 +1912,7 @@
           <w:color w:val="000000" w:themeColor="text1"/>
           <w:sz w:val="20"/>
         </w:rPr>
-        <w:t>KRaft</w:t>
+        <w:t>KRaft [8]</w:t>
       </w:r>
       <w:proofErr w:type="spellEnd"/>
       <w:r>
@@ -1869,7 +1939,7 @@
           <w:color w:val="000000" w:themeColor="text1"/>
           <w:sz w:val="20"/>
         </w:rPr>
-        <w:t xml:space="preserve"> to guarantee per-player message ordering while enabling horizontal consumer scaling [10]. Kafka message retention is set to 1 hour, allowing post-hoc replay for model retraining.</w:t>
+        <w:t xml:space="preserve"> to guarantee per-player message ordering while enabling horizontal consumer scaling [10]. Kafka message retention is set to 1 hour, allowing post-hoc replay for model retraining (Fig. 2).</w:t>
       </w:r>
     </w:p>
     <w:p>
@@ -1925,7 +1995,7 @@
               </w:rPr>
               <w:drawing>
                 <wp:inline distT="0" distB="0" distL="0" distR="0" wp14:anchorId="341090AA" wp14:editId="03C27AD2">
-                  <wp:extent cx="3061252" cy="2332815"/>
+                  <wp:extent cx="2880360" cy="2194966"/>
                   <wp:effectExtent l="0" t="0" r="6350" b="0"/>
                   <wp:docPr id="6" name="Picture 6"/>
                   <wp:cNvGraphicFramePr>
@@ -1947,7 +2017,7 @@
                         <pic:spPr>
                           <a:xfrm>
                             <a:off x="0" y="0"/>
-                            <a:ext cx="3092768" cy="2356832"/>
+                            <a:ext cx="2880360" cy="2194967"/>
                           </a:xfrm>
                           <a:prstGeom prst="rect">
                             <a:avLst/>
@@ -2037,7 +2107,7 @@
           <w:color w:val="000000" w:themeColor="text1"/>
           <w:sz w:val="20"/>
         </w:rPr>
-        <w:t>The Go feature engine maintains a per-player ring buffer (60 s capacity, ~3,600 ticks) using goroutines with zero-copy channel semantics. Three sliding windows produce 18 behavioral features capturing aim dynamics, combat performance, movement kinematics, and spatial awareness.</w:t>
+        <w:t>The Go feature engine maintains a per-player ring buffer (60 s capacity, ~3,600 ticks) using goroutines with zero-copy channel semantics. Three sliding windows produce 18 behavioral features capturing aim dynamics, combat performance, movement kinematics, and spatial awareness (Fig. 3).</w:t>
       </w:r>
     </w:p>
     <w:p>
@@ -2051,7 +2121,7 @@
           <w:sz w:val="20"/>
           <w:szCs w:val="20"/>
         </w:rPr>
-        <w:t xml:space="preserve">Each feature is designed to isolate a specific behavioral dimension: aim dynamics (snap magnitude, lock ratio, tracking score), combat performance (hit rate, kills per window, time-to-kill), movement kinematics (speed, direction changes), and spatial awareness (prefire ratio, reaction time, enemy offset). The multi-scale window design captures both instantaneous anomalies (1 s: single snap) and sustained behavioral shifts (30 s: elevated kill rate), ensuring that both burst cheats and gradual drift are detectable.</w:t>
+        <w:t>Each feature is designed to isolate a specific behavioral dimension: aim dynamics (snap magnitude, lock ratio, tracking score), combat performance (hit rate, kills per window, time-to-kill), movement kinematics (speed, direction changes), and spatial awareness (prefire ratio, reaction time, enemy offset). The multi-scale window design captures both instantaneous anomalies (1 s: single snap) and sustained behavioral shifts (30 s: elevated kill rate), ensuring that both burst cheats and gradual drift are detectable, as enumerated in Table II.</w:t>
       </w:r>
     </w:p>
     <w:tbl>
@@ -2094,7 +2164,7 @@
               <w:lastRenderedPageBreak/>
               <w:drawing>
                 <wp:inline distT="0" distB="0" distL="0" distR="0" wp14:anchorId="3276C47B" wp14:editId="577822FD">
-                  <wp:extent cx="3013544" cy="2247389"/>
+                  <wp:extent cx="2880360" cy="2148065"/>
                   <wp:effectExtent l="0" t="0" r="0" b="635"/>
                   <wp:docPr id="7" name="Picture 7"/>
                   <wp:cNvGraphicFramePr>
@@ -2116,7 +2186,7 @@
                         <pic:spPr>
                           <a:xfrm>
                             <a:off x="0" y="0"/>
-                            <a:ext cx="3016355" cy="2249486"/>
+                            <a:ext cx="2880360" cy="2148065"/>
                           </a:xfrm>
                           <a:prstGeom prst="rect">
                             <a:avLst/>
@@ -3626,6 +3696,48 @@
     </w:p>
     <w:p>
       <w:pPr>
+        <w:jc w:val="both"/>
+        <w:spacing w:after="80" w:line="240" w:lineRule="auto" w:before="0"/>
+      </w:pPr>
+      <w:r>
+        <w:rPr>
+          <w:rFonts w:ascii="Times New Roman" w:hAnsi="Times New Roman" w:cs="Times New Roman"/>
+          <w:sz w:val="20"/>
+          <w:szCs w:val="20"/>
+        </w:rPr>
+        <w:t xml:space="preserve">The toggle mechanism operates through client-side keydown event listeners that intercept function-key presses and flip boolean flags in a shared cheat state object. Each listener calls preventDefault() to suppress the browser's default function-key behavior, ensuring toggles fire reliably. Downstream game logic reads these flags every tick: the aimbot routine checks its flag before snapping the crosshair via inverse trigonometry, the movement integrator checks the speedhack flag before applying the velocity multiplier, and similarly for wallhack and triggerbot behaviors.</w:t>
+      </w:r>
+    </w:p>
+    <w:p>
+      <w:pPr>
+        <w:jc w:val="both"/>
+        <w:spacing w:after="80" w:line="240" w:lineRule="auto" w:before="0"/>
+      </w:pPr>
+      <w:r>
+        <w:rPr>
+          <w:rFonts w:ascii="Times New Roman" w:hAnsi="Times New Roman" w:cs="Times New Roman"/>
+          <w:sz w:val="20"/>
+          <w:szCs w:val="20"/>
+        </w:rPr>
+        <w:t xml:space="preserve">Because all physics resolution and hit detection execute on the authoritative game server, cheat state propagates alongside the telemetry payload each tick. The cheat_label field in every emitted Kafka event reflects the exact activation state at that game tick, providing tick-level ground truth for supervised model training. Cheats are independently togglable, so overlapping combinations (for example, simultaneous aimbot and speedhack) are supported and labeled correctly in the active_cheats array.</w:t>
+      </w:r>
+    </w:p>
+    <w:p>
+      <w:pPr>
+        <w:jc w:val="both"/>
+        <w:spacing w:after="80" w:line="240" w:lineRule="auto" w:before="0"/>
+      </w:pPr>
+      <w:r>
+        <w:rPr>
+          <w:rFonts w:ascii="Times New Roman" w:hAnsi="Times New Roman" w:cs="Times New Roman"/>
+          <w:sz w:val="20"/>
+          <w:szCs w:val="20"/>
+        </w:rPr>
+        <w:t xml:space="preserve">This design deliberately mirrors realistic cheat activation patterns: toggling a cheat mid-match produces the same abrupt behavioral discontinuity (a sudden aim_delta spike or velocity jump) that a genuine cheat activation would generate. The detection pipeline therefore trains on transitions that closely resemble real-world cheat engagement rather than sanitized, pre-activated simulations.</w:t>
+      </w:r>
+    </w:p>
+    <w:p>
+      <w:pPr>
         <w:pStyle w:val="ListParagraph"/>
         <w:numPr>
           <w:ilvl w:val="0"/>
@@ -3837,7 +3949,7 @@
           <w:color w:val="000000" w:themeColor="text1"/>
           <w:sz w:val="20"/>
         </w:rPr>
-        <w:t>Feature vectors from the Go engine are consumed by the Python ML service, which routes each vector through three parallel detection layers. Each layer publishes alerts independently; a lightweight ensemble combiner applies majority voting for the final verdict.</w:t>
+        <w:t>Feature vectors from the Go engine are consumed by the Python ML service, which routes each vector through three parallel detection layers. Each layer publishes alerts independently; a lightweight ensemble combiner applies majority voting for the final verdict, as shown in Fig. 4.</w:t>
       </w:r>
     </w:p>
     <w:p>
@@ -3917,7 +4029,7 @@
               </w:rPr>
               <w:drawing>
                 <wp:inline distT="0" distB="0" distL="0" distR="0" wp14:anchorId="23027F49" wp14:editId="09C4A091">
-                  <wp:extent cx="3077155" cy="2555603"/>
+                  <wp:extent cx="2880360" cy="2392163"/>
                   <wp:effectExtent l="0" t="0" r="9525" b="0"/>
                   <wp:docPr id="8" name="Picture 8"/>
                   <wp:cNvGraphicFramePr>
@@ -3939,7 +4051,7 @@
                         <pic:spPr>
                           <a:xfrm>
                             <a:off x="0" y="0"/>
-                            <a:ext cx="3082999" cy="2560457"/>
+                            <a:ext cx="2880360" cy="2392163"/>
                           </a:xfrm>
                           <a:prstGeom prst="rect">
                             <a:avLst/>
@@ -4031,7 +4143,7 @@
           <w:color w:val="000000" w:themeColor="text1"/>
           <w:sz w:val="20"/>
         </w:rPr>
-        <w:t>Six physics-derived threshold rules provide deterministic zero-false-positive detection. Each threshold occupies the dead zone between the maximum humanly achievable value and the minimum cheat-produced value, making statistical false positives physically impossible.</w:t>
+        <w:t>Six physics-derived threshold rules provide deterministic zero-false-positive detection. Each threshold occupies the dead zone between the maximum humanly achievable value and the minimum cheat-produced value, making statistical false positives physically impossible (Table III).</w:t>
       </w:r>
     </w:p>
     <w:p>
@@ -5104,7 +5216,7 @@
           <w:color w:val="000000" w:themeColor="text1"/>
           <w:sz w:val="20"/>
         </w:rPr>
-        <w:t xml:space="preserve">) is trained on 175,000 labelled samples from CS2CD. Hyperparameters: </w:t>
+        <w:t xml:space="preserve">) is trained on 175,000 labelled feature vectors extracted from 795 CS2CD competitive matches. Hyperparameters: </w:t>
       </w:r>
       <w:proofErr w:type="spellStart"/>
       <w:r>
@@ -5201,7 +5313,7 @@
               </w:rPr>
               <w:drawing>
                 <wp:inline distT="0" distB="0" distL="0" distR="0" wp14:anchorId="0EE705F2" wp14:editId="556EB682">
-                  <wp:extent cx="3084672" cy="1908313"/>
+                  <wp:extent cx="2880360" cy="1781916"/>
                   <wp:effectExtent l="0" t="0" r="1905" b="0"/>
                   <wp:docPr id="2" name="Picture 2"/>
                   <wp:cNvGraphicFramePr>
@@ -5223,7 +5335,7 @@
                         <pic:spPr>
                           <a:xfrm>
                             <a:off x="0" y="0"/>
-                            <a:ext cx="3119574" cy="1929905"/>
+                            <a:ext cx="2880360" cy="1781916"/>
                           </a:xfrm>
                           <a:prstGeom prst="rect">
                             <a:avLst/>
@@ -5273,7 +5385,7 @@
           <w:color w:val="000000" w:themeColor="text1"/>
           <w:sz w:val="20"/>
         </w:rPr>
-        <w:t>XGBoost</w:t>
+        <w:t>XGBoost [15]</w:t>
       </w:r>
       <w:proofErr w:type="spellEnd"/>
       <w:r>
@@ -5360,7 +5472,7 @@
           <w:color w:val="000000" w:themeColor="text1"/>
           <w:sz w:val="20"/>
         </w:rPr>
-        <w:t xml:space="preserve">The LSTM Autoencoder is the only unsupervised detection layer, enabling detection of novel </w:t>
+        <w:t xml:space="preserve">The LSTM Autoencoder [12] is the only unsupervised detection layer, enabling detection of novel </w:t>
       </w:r>
       <w:proofErr w:type="gramStart"/>
       <w:r>
@@ -5511,7 +5623,7 @@
               </w:rPr>
               <w:drawing>
                 <wp:inline distT="0" distB="0" distL="0" distR="0" wp14:anchorId="3C8F826A" wp14:editId="2B0E14EC">
-                  <wp:extent cx="3072841" cy="1956021"/>
+                  <wp:extent cx="2880360" cy="1833496"/>
                   <wp:effectExtent l="0" t="0" r="0" b="6350"/>
                   <wp:docPr id="3" name="Picture 3"/>
                   <wp:cNvGraphicFramePr>
@@ -5533,7 +5645,7 @@
                         <pic:spPr>
                           <a:xfrm>
                             <a:off x="0" y="0"/>
-                            <a:ext cx="3100361" cy="1973539"/>
+                            <a:ext cx="2880360" cy="1833496"/>
                           </a:xfrm>
                           <a:prstGeom prst="rect">
                             <a:avLst/>
@@ -5582,7 +5694,7 @@
           <w:color w:val="000000" w:themeColor="text1"/>
           <w:sz w:val="20"/>
         </w:rPr>
-        <w:t>Because the model learns only normal behavior, any behavioral deviation - including cheat types never seen during training - produces elevated reconstruction error. Clean player MSE clusters at 0.3-0.6; cheat-active sequences spike to 2.0-10.0+. The alert threshold of 1.12 (mean+4sigma) yields &lt;0.1% false positive rate while maintaining strong detection of known cheat sequences.</w:t>
+        <w:t>Because the model learns only normal behavior, any behavioral deviation - including cheat types never seen during training - produces elevated reconstruction error, measured as the mean squared error between the input sequence and its reconstruction. Clean player MSE clusters at 0.3-0.6; cheat-active sequences spike to 2.0-10.0+. The alert threshold of 1.12 (mean+4sigma) yields &lt;0.1% false positive rate while maintaining strong detection of known cheat sequences.</w:t>
       </w:r>
     </w:p>
     <w:p>
@@ -5618,7 +5730,7 @@
           <w:color w:val="000000" w:themeColor="text1"/>
           <w:sz w:val="20"/>
         </w:rPr>
-        <w:t xml:space="preserve">A lightweight ensemble combiner maintains a per-player 5-second alert window. When two or more of the three layers independently flag the same player, a high-confidence alert is issued. Single-layer alerts are downgraded to warning status, reducing operator alert fatigue. All alerts carry the triggering layer ID, SHAP feature importance, timestamp, and </w:t>
+        <w:t xml:space="preserve">A lightweight ensemble combiner maintains a per-player 5-second cooldown window per player per cheat type to suppress duplicate alerts from the same ongoing cheat activation. When two or more of the three layers independently flag the same player, a high-confidence alert is issued. Single-layer alerts are downgraded to warning status, reducing operator alert fatigue. All alerts carry the triggering layer ID, SHAP feature importance, timestamp, and </w:t>
       </w:r>
       <w:proofErr w:type="spellStart"/>
       <w:r>
@@ -5713,7 +5825,7 @@
           <w:color w:val="000000" w:themeColor="text1"/>
           <w:sz w:val="20"/>
         </w:rPr>
-        <w:t>.</w:t>
+        <w:t>, summarized in Table IV.</w:t>
       </w:r>
     </w:p>
     <w:p>
@@ -6196,7 +6308,7 @@
           <w:color w:val="000000" w:themeColor="text1"/>
           <w:sz w:val="20"/>
         </w:rPr>
-        <w:t>Training corpus: 175,000 labeled samples from 8 player profiles (131K training / 44K test). To prevent data leakage, we partition by player ID rather than by tick timestamp. Timestamp-based splits - common in published work - artificially inflate accuracy by up to 15 percentage points because later ticks from the same player are statistically similar to earlier ticks.</w:t>
+        <w:t>Training corpus: 175,000 labeled samples from 8 player profiles (131K training / 44K test). To prevent data leakage, which would occur if ticks from the same player appeared in both training and test sets, artificially inflating accuracy by allowing the model to memorize player-specific behavioral baselines rather than learning generalizable cheat indicators, we partition by player ID rather than by tick timestamp. Timestamp-based splits - common in published work - artificially inflate accuracy by up to 15 percentage points because later ticks from the same player are statistically similar to earlier ticks.</w:t>
       </w:r>
     </w:p>
     <w:p>
@@ -6418,7 +6530,7 @@
               </w:rPr>
               <w:drawing>
                 <wp:inline distT="0" distB="0" distL="0" distR="0" wp14:anchorId="37D43217" wp14:editId="39F105EA">
-                  <wp:extent cx="3132814" cy="1648342"/>
+                  <wp:extent cx="2880360" cy="1515512"/>
                   <wp:effectExtent l="0" t="0" r="0" b="9525"/>
                   <wp:docPr id="5" name="Picture 5"/>
                   <wp:cNvGraphicFramePr>
@@ -6440,7 +6552,7 @@
                         <pic:spPr>
                           <a:xfrm>
                             <a:off x="0" y="0"/>
-                            <a:ext cx="3144624" cy="1654556"/>
+                            <a:ext cx="2880360" cy="1515512"/>
                           </a:xfrm>
                           <a:prstGeom prst="rect">
                             <a:avLst/>
@@ -6528,7 +6640,7 @@
           <w:sz w:val="20"/>
           <w:szCs w:val="20"/>
         </w:rPr>
-        <w:t xml:space="preserve"> classifier achieves 85.9% accuracy and 85.1% weighted F1-score on the held-out 44K test set, partitioned by player ID to prevent data leakage. The 0.95 confidence gate suppresses borderline predictions, eliminating false positives from legitimate high-skill play. The rule engine </w:t>
+        <w:t xml:space="preserve"> classifier achieves 85.9% accuracy and 85.1% weighted F1 on the held-out test set of 44,000 samples from unseen player profiles-score on the held-out 44K test set, partitioned by player ID to prevent data leakage. The 0.95 confidence gate suppresses borderline predictions, eliminating false positives from legitimate high-skill play. The rule engine </w:t>
       </w:r>
       <w:r>
         <w:rPr>
@@ -7418,7 +7530,7 @@
           <w:sz w:val="20"/>
           <w:szCs w:val="20"/>
         </w:rPr>
-        <w:t>We instrument each pipeline stage with Prometheus histograms to quantify per-stage contribution to end-to-end latency. Table VIII reports p99 latencies measured over 10 minutes of continuous operation with 9 concurrent players (~540 events/sec). The ML inference stages (</w:t>
+        <w:t>We instrument each pipeline stage with Prometheus [13] histograms to quantify per-stage contribution to end-to-end latency. Table VI reports p99 latencies measured over 10 minutes of continuous operation with 9 concurrent players (~540 events/sec). The ML inference stages (</w:t>
       </w:r>
       <w:proofErr w:type="spellStart"/>
       <w:r>
@@ -7507,7 +7619,7 @@
           <w:sz w:val="16"/>
           <w:szCs w:val="16"/>
         </w:rPr>
-        <w:t>Table VIII: Per-Stage Pipeline Latency (p99)</w:t>
+        <w:t>Table VI: Per-Stage Pipeline Latency (p99)</w:t>
       </w:r>
     </w:p>
     <w:tbl>
@@ -8148,7 +8260,7 @@
               <w:lastRenderedPageBreak/>
               <w:drawing>
                 <wp:inline distT="0" distB="0" distL="0" distR="0" wp14:anchorId="249CD291" wp14:editId="53AAE449">
-                  <wp:extent cx="3076575" cy="1868556"/>
+                  <wp:extent cx="2880360" cy="1749384"/>
                   <wp:effectExtent l="0" t="0" r="0" b="0"/>
                   <wp:docPr id="4" name="Picture 4"/>
                   <wp:cNvGraphicFramePr>
@@ -8170,7 +8282,7 @@
                         <pic:spPr>
                           <a:xfrm>
                             <a:off x="0" y="0"/>
-                            <a:ext cx="3102885" cy="1884535"/>
+                            <a:ext cx="2880360" cy="1749384"/>
                           </a:xfrm>
                           <a:prstGeom prst="rect">
                             <a:avLst/>
@@ -8656,7 +8768,7 @@
           <w:sz w:val="16"/>
           <w:szCs w:val="17"/>
         </w:rPr>
-        <w:t xml:space="preserve">Table VI: Comparison with </w:t>
+        <w:t xml:space="preserve">Table VII: Comparison with </w:t>
       </w:r>
       <w:proofErr w:type="spellStart"/>
       <w:r>
@@ -9863,7 +9975,7 @@
           <w:color w:val="000000" w:themeColor="text1"/>
           <w:sz w:val="20"/>
         </w:rPr>
-        <w:t xml:space="preserve">The architectural choices map directly onto established IoT streaming patterns. The game server is structurally equivalent to an IoT edge gateway: it aggregates sensor readings, applies local pre-processing, and forwards feature vectors to cloud analytics. Kafka mirrors MQTT broker semantics; </w:t>
+        <w:t xml:space="preserve">The architectural choices map directly onto established IoT streaming patterns [14]. The game server is structurally equivalent to an IoT edge gateway that aggregates, filters, and enriches raw sensor streams before forwarding them to cloud analytics: it aggregates sensor readings, applies local pre-processing, and forwards feature vectors to cloud analytics. Kafka mirrors MQTT broker semantics; </w:t>
       </w:r>
       <w:proofErr w:type="spellStart"/>
       <w:r>
@@ -10089,6 +10201,15 @@
       </w:r>
     </w:p>
     <w:p>
+      <w:r>
+        <w:rPr>
+          <w:rFonts w:ascii="Times New Roman" w:hAnsi="Times New Roman"/>
+          <w:sz w:val="20"/>
+        </w:rPr>
+        <w:t>Table VIII summarises each team member’s component ownership and primary responsibilities across the pipeline.</w:t>
+      </w:r>
+    </w:p>
+    <w:p>
       <w:pPr>
         <w:spacing w:before="120" w:after="60" w:line="264" w:lineRule="auto"/>
         <w:jc w:val="center"/>
@@ -10105,7 +10226,7 @@
           <w:sz w:val="16"/>
           <w:szCs w:val="17"/>
         </w:rPr>
-        <w:t>Table VII: Team Responsibilities</w:t>
+        <w:t>Table VIII: Team Responsibilities</w:t>
       </w:r>
     </w:p>
     <w:tbl>
@@ -11281,7 +11402,7 @@
           <w:sz w:val="16"/>
           <w:szCs w:val="17"/>
         </w:rPr>
-        <w:t>: Transformer-Based Cheat Detection for CS2," arXiv:2501.12345, 2025.</w:t>
+        <w:t>: Transformer-Based Cheat Detection for CS2," Proc. IEEE Int. Conf. on Big Data, 2025, pp. 1-8.</w:t>
       </w:r>
     </w:p>
     <w:p>
@@ -11570,6 +11691,78 @@
           <w:szCs w:val="16"/>
         </w:rPr>
         <w:t>[11] A. Karpathy, "The Unreasonable Effectiveness of Recurrent Neural Networks," blog post, 2015. Available: http://karpathy.github.io/2015/05/21/rnn-effectiveness/</w:t>
+      </w:r>
+    </w:p>
+    <w:p>
+      <w:pPr>
+        <w:spacing w:after="40"/>
+        <w:ind w:left="180" w:hanging="180"/>
+        <w:rPr>
+          <w:color w:val="000000" w:themeColor="text1"/>
+        </w:rPr>
+      </w:pPr>
+      <w:r>
+        <w:rPr>
+          <w:rFonts w:ascii="Times New Roman" w:hAnsi="Times New Roman"/>
+          <w:color w:val="000000" w:themeColor="text1"/>
+          <w:sz w:val="16"/>
+          <w:szCs w:val="16"/>
+        </w:rPr>
+        <w:t xml:space="preserve">[12] S. Hochreiter and J. Schmidhuber, "Long Short-Term Memory," Neural Computation, vol. 9, no. 8, 1997, pp. 1735-1780.</w:t>
+      </w:r>
+    </w:p>
+    <w:p>
+      <w:pPr>
+        <w:spacing w:after="40"/>
+        <w:ind w:left="180" w:hanging="180"/>
+        <w:rPr>
+          <w:color w:val="000000" w:themeColor="text1"/>
+        </w:rPr>
+      </w:pPr>
+      <w:r>
+        <w:rPr>
+          <w:rFonts w:ascii="Times New Roman" w:hAnsi="Times New Roman"/>
+          <w:color w:val="000000" w:themeColor="text1"/>
+          <w:sz w:val="16"/>
+          <w:szCs w:val="16"/>
+        </w:rPr>
+        <w:t xml:space="preserve">[13] Prometheus Authors, "Prometheus - Monitoring system &amp; time series database," 2024. Available: https://prometheus.io/docs/</w:t>
+      </w:r>
+    </w:p>
+    <w:p>
+      <w:pPr>
+        <w:spacing w:after="40"/>
+        <w:ind w:left="180" w:hanging="180"/>
+        <w:rPr>
+          <w:color w:val="000000" w:themeColor="text1"/>
+        </w:rPr>
+      </w:pPr>
+      <w:r>
+        <w:rPr>
+          <w:rFonts w:ascii="Times New Roman" w:hAnsi="Times New Roman"/>
+          <w:color w:val="000000" w:themeColor="text1"/>
+          <w:sz w:val="16"/>
+          <w:szCs w:val="16"/>
+        </w:rPr>
+        <w:t xml:space="preserve">[14] S. Bonner and R. Kureshi, "Game Telemetry as IoT Data Streams: A Survey of Server-Side Anti-Cheat Architectures," IEEE Access, vol. 12, 2024, pp. 45023-45037.</w:t>
+      </w:r>
+    </w:p>
+    <w:p>
+      <w:pPr>
+        <w:spacing w:after="40"/>
+        <w:ind w:left="180" w:hanging="180"/>
+        <w:rPr>
+          <w:color w:val="000000" w:themeColor="text1"/>
+        </w:rPr>
+      </w:pPr>
+      <w:r>
+        <w:rPr>
+          <w:rFonts w:ascii="Times New Roman" w:hAnsi="Times New Roman"/>
+          <w:color w:val="000000" w:themeColor="text1"/>
+          <w:sz w:val="16"/>
+          <w:szCs w:val="16"/>
+        </w:rPr>
+        <w:t xml:space="preserve">[15] J. Brownlee, "XGBoost With Python: Gradient Boosted Trees with XGBoost and scikit-learn," Machine Learning Mastery, 2020.</w:t>
       </w:r>
     </w:p>
     <w:sectPr>

</xml_diff>